<commit_message>
CV (IT Support): add documentation, clarify ERP wording
Co-Authored-By: Claude Opus 5.5 <noreply@anthropic.com>
Claude-Session: https://claude.ai/code/session_01CMn8zBKDwWijX1DHa9YA5f
</commit_message>
<xml_diff>
--- a/cv/Sidharth_K_CV_IT_Support.docx
+++ b/cv/Sidharth_K_CV_IT_Support.docx
@@ -117,7 +117,7 @@
           <w:b w:val="0"/>
           <w:i w:val="0"/>
         </w:rPr>
-        <w:t>IT professional with nearly 6 years of experience across hands-on IT support and business application development. Skilled in setting up and configuring desktops, laptops, printers, and peripherals, troubleshooting hardware, software, and network issues, and performing preventive maintenance and system updates. As an Application Developer, supports business applications (billing, e-invoicing, logistics), with a strong understanding of ERP-style systems. Clear communicator who helps users, works closely with team members, and has supported international clients under pressure.</w:t>
+        <w:t>IT professional with nearly 6 years of experience across hands-on IT support and business application development. Skilled in setting up and configuring desktops, laptops, printers, and peripherals, troubleshooting hardware, software, and network issues, and performing preventive maintenance and system updates. As an Application Developer, supports business applications similar to ERP modules (billing, e-invoicing, logistics). Clear communicator who helps users, works closely with team members, and has supported international clients under pressure.</w:t>
       </w:r>
     </w:p>
     <w:p>
@@ -162,7 +162,7 @@
         <w:t xml:space="preserve">Troubleshooting &amp; Support: </w:t>
       </w:r>
       <w:r>
-        <w:t>Hardware Diagnostics, Software Issues, Network Troubleshooting, End-User Support</w:t>
+        <w:t>Hardware Diagnostics, Software Issues, Network Troubleshooting, End-User Support, Documentation</w:t>
       </w:r>
     </w:p>
     <w:p>
@@ -413,6 +413,15 @@
       </w:pPr>
       <w:r>
         <w:t>Performed preventive maintenance, system updates, and performance optimization for desktops and laptops.</w:t>
+      </w:r>
+    </w:p>
+    <w:p>
+      <w:pPr>
+        <w:pStyle w:val="ListBullet"/>
+        <w:spacing w:after="20"/>
+      </w:pPr>
+      <w:r>
+        <w:t>Maintained records of technical issues, solutions provided, and device inventory.</w:t>
       </w:r>
     </w:p>
     <w:p>

</xml_diff>